<commit_message>
Bổ sung phần giải thích cách nghĩ cho Workbook 1 và 2
Bản cũ chỉ có tiêu đề và chỗ điền, khó dùng độc lập khi học viên tự tải
repo về mà không có giảng viên diễn giải tại lớp. Mỗi mục/bảng giờ có
đoạn "Cách nghĩ" giải thích trước khi điền, không kèm ví dụ điền sẵn.

Co-Authored-By: Claude Sonnet 5 <noreply@anthropic.com>
</commit_message>
<xml_diff>
--- a/tai-lieu-hoc-vien/workbooks/WORKBOOK-2.docx
+++ b/tai-lieu-hoc-vien/workbooks/WORKBOOK-2.docx
@@ -338,6 +338,78 @@
     <w:p>
       <w:pPr>
         <w:pBdr>
+          <w:top w:val="single" w:color="FBF2E1" w:sz="2" w:space="4"/>
+          <w:bottom w:val="single" w:color="FBF2E1" w:sz="2" w:space="4"/>
+          <w:left w:val="single" w:color="B8860B" w:sz="24" w:space="8"/>
+          <w:right w:val="single" w:color="FBF2E1" w:sz="2" w:space="4"/>
+        </w:pBdr>
+        <w:shd w:fill="FBF2E1" w:val="clear"/>
+        <w:spacing w:after="200" w:before="100" w:line="300"/>
+        <w:ind w:left="100"/>
+      </w:pPr>
+      <w:r>
+        <w:rPr>
+          <w:rFonts w:ascii="Calibri" w:cs="Calibri" w:eastAsia="Calibri" w:hAnsi="Calibri"/>
+          <w:i/>
+          <w:iCs/>
+          <w:color w:val="1B1F1F"/>
+          <w:sz w:val="20"/>
+          <w:szCs w:val="20"/>
+        </w:rPr>
+        <w:t xml:space="preserve">Buổi sáng chốt </w:t>
+      </w:r>
+      <w:r>
+        <w:rPr>
+          <w:rFonts w:ascii="Calibri" w:cs="Calibri" w:eastAsia="Calibri" w:hAnsi="Calibri"/>
+          <w:b/>
+          <w:bCs/>
+          <w:i/>
+          <w:iCs/>
+          <w:color w:val="1B1F1F"/>
+          <w:sz w:val="20"/>
+          <w:szCs w:val="20"/>
+        </w:rPr>
+        <w:t xml:space="preserve">AI nên làm gì</w:t>
+      </w:r>
+      <w:r>
+        <w:rPr>
+          <w:rFonts w:ascii="Calibri" w:cs="Calibri" w:eastAsia="Calibri" w:hAnsi="Calibri"/>
+          <w:i/>
+          <w:iCs/>
+          <w:color w:val="1B1F1F"/>
+          <w:sz w:val="20"/>
+          <w:szCs w:val="20"/>
+        </w:rPr>
+        <w:t xml:space="preserve"> (Canvas). Buổi chiều này chốt </w:t>
+      </w:r>
+      <w:r>
+        <w:rPr>
+          <w:rFonts w:ascii="Calibri" w:cs="Calibri" w:eastAsia="Calibri" w:hAnsi="Calibri"/>
+          <w:b/>
+          <w:bCs/>
+          <w:i/>
+          <w:iCs/>
+          <w:color w:val="1B1F1F"/>
+          <w:sz w:val="20"/>
+          <w:szCs w:val="20"/>
+        </w:rPr>
+        <w:t xml:space="preserve">hệ thống được ghép từ những mảnh nào, và mảnh nào hỏng thì xử lý ra sao</w:t>
+      </w:r>
+      <w:r>
+        <w:rPr>
+          <w:rFonts w:ascii="Calibri" w:cs="Calibri" w:eastAsia="Calibri" w:hAnsi="Calibri"/>
+          <w:i/>
+          <w:iCs/>
+          <w:color w:val="1B1F1F"/>
+          <w:sz w:val="20"/>
+          <w:szCs w:val="20"/>
+        </w:rPr>
+        <w:t xml:space="preserve"> (Blueprint). Không viết code mới — Bước 1 là đọc code đã có sẵn để hiểu nó vận hành thế nào trước khi vẽ lại thành sơ đồ.</w:t>
+      </w:r>
+    </w:p>
+    <w:p>
+      <w:pPr>
+        <w:pBdr>
           <w:bottom w:val="single" w:color="BFD3D2" w:sz="4" w:space="1"/>
         </w:pBdr>
         <w:spacing w:after="200" w:before="120"/>
@@ -499,6 +571,87 @@
           <w:szCs w:val="22"/>
         </w:rPr>
         <w:t xml:space="preserve">Câu 1 — Luồng dữ liệu khi gửi một ticket</w:t>
+      </w:r>
+    </w:p>
+    <w:p>
+      <w:pPr>
+        <w:pBdr>
+          <w:top w:val="single" w:color="FBF2E1" w:sz="2" w:space="4"/>
+          <w:bottom w:val="single" w:color="FBF2E1" w:sz="2" w:space="4"/>
+          <w:left w:val="single" w:color="B8860B" w:sz="24" w:space="8"/>
+          <w:right w:val="single" w:color="FBF2E1" w:sz="2" w:space="4"/>
+        </w:pBdr>
+        <w:shd w:fill="FBF2E1" w:val="clear"/>
+        <w:spacing w:after="200" w:before="100" w:line="300"/>
+        <w:ind w:left="100"/>
+      </w:pPr>
+      <w:r>
+        <w:rPr>
+          <w:rFonts w:ascii="Calibri" w:cs="Calibri" w:eastAsia="Calibri" w:hAnsi="Calibri"/>
+          <w:b/>
+          <w:bCs/>
+          <w:i/>
+          <w:iCs/>
+          <w:color w:val="1B1F1F"/>
+          <w:sz w:val="20"/>
+          <w:szCs w:val="20"/>
+        </w:rPr>
+        <w:t xml:space="preserve">Cách nghĩ:</w:t>
+      </w:r>
+      <w:r>
+        <w:rPr>
+          <w:rFonts w:ascii="Calibri" w:cs="Calibri" w:eastAsia="Calibri" w:hAnsi="Calibri"/>
+          <w:i/>
+          <w:iCs/>
+          <w:color w:val="1B1F1F"/>
+          <w:sz w:val="20"/>
+          <w:szCs w:val="20"/>
+        </w:rPr>
+        <w:t xml:space="preserve"> đừng đọc toàn bộ code — lần theo đúng MỘT đường đi của một ticket, từ lúc vào tới lúc ra. Điểm bắt đầu tốt nhất là </w:t>
+      </w:r>
+      <w:r>
+        <w:rPr>
+          <w:rFonts w:ascii="Consolas" w:cs="Consolas" w:eastAsia="Consolas" w:hAnsi="Consolas"/>
+          <w:i/>
+          <w:iCs/>
+          <w:color w:val="0B3F41"/>
+          <w:sz w:val="19"/>
+          <w:szCs w:val="19"/>
+        </w:rPr>
+        <w:t xml:space="preserve">src/agent/workflow.py</w:t>
+      </w:r>
+      <w:r>
+        <w:rPr>
+          <w:rFonts w:ascii="Calibri" w:cs="Calibri" w:eastAsia="Calibri" w:hAnsi="Calibri"/>
+          <w:i/>
+          <w:iCs/>
+          <w:color w:val="1B1F1F"/>
+          <w:sz w:val="20"/>
+          <w:szCs w:val="20"/>
+        </w:rPr>
+        <w:t xml:space="preserve"> (hàm </w:t>
+      </w:r>
+      <w:r>
+        <w:rPr>
+          <w:rFonts w:ascii="Consolas" w:cs="Consolas" w:eastAsia="Consolas" w:hAnsi="Consolas"/>
+          <w:i/>
+          <w:iCs/>
+          <w:color w:val="0B3F41"/>
+          <w:sz w:val="19"/>
+          <w:szCs w:val="19"/>
+        </w:rPr>
+        <w:t xml:space="preserve">process_ticket</w:t>
+      </w:r>
+      <w:r>
+        <w:rPr>
+          <w:rFonts w:ascii="Calibri" w:cs="Calibri" w:eastAsia="Calibri" w:hAnsi="Calibri"/>
+          <w:i/>
+          <w:iCs/>
+          <w:color w:val="1B1F1F"/>
+          <w:sz w:val="20"/>
+          <w:szCs w:val="20"/>
+        </w:rPr>
+        <w:t xml:space="preserve">) — đọc phần thân hàm theo thứ tự, mỗi lần thấy gọi sang module khác thì ghi tên tệp đó vào một ô trống. Bạn sẽ đi qua đúng 6 tệp trước khi tới "dự thảo chờ duyệt".</w:t>
       </w:r>
     </w:p>
     <w:p>
@@ -618,6 +771,43 @@
           <w:szCs w:val="22"/>
         </w:rPr>
         <w:t xml:space="preserve">Câu 2 — Trách nhiệm từng tệp</w:t>
+      </w:r>
+    </w:p>
+    <w:p>
+      <w:pPr>
+        <w:pBdr>
+          <w:top w:val="single" w:color="FBF2E1" w:sz="2" w:space="4"/>
+          <w:bottom w:val="single" w:color="FBF2E1" w:sz="2" w:space="4"/>
+          <w:left w:val="single" w:color="B8860B" w:sz="24" w:space="8"/>
+          <w:right w:val="single" w:color="FBF2E1" w:sz="2" w:space="4"/>
+        </w:pBdr>
+        <w:shd w:fill="FBF2E1" w:val="clear"/>
+        <w:spacing w:after="200" w:before="100" w:line="300"/>
+        <w:ind w:left="100"/>
+      </w:pPr>
+      <w:r>
+        <w:rPr>
+          <w:rFonts w:ascii="Calibri" w:cs="Calibri" w:eastAsia="Calibri" w:hAnsi="Calibri"/>
+          <w:b/>
+          <w:bCs/>
+          <w:i/>
+          <w:iCs/>
+          <w:color w:val="1B1F1F"/>
+          <w:sz w:val="20"/>
+          <w:szCs w:val="20"/>
+        </w:rPr>
+        <w:t xml:space="preserve">Cách nghĩ:</w:t>
+      </w:r>
+      <w:r>
+        <w:rPr>
+          <w:rFonts w:ascii="Calibri" w:cs="Calibri" w:eastAsia="Calibri" w:hAnsi="Calibri"/>
+          <w:i/>
+          <w:iCs/>
+          <w:color w:val="1B1F1F"/>
+          <w:sz w:val="20"/>
+          <w:szCs w:val="20"/>
+        </w:rPr>
+        <w:t xml:space="preserve"> "chịu trách nhiệm gì" nghĩa là — nếu xóa tệp này, hệ thống mất khả năng gì? Trả lời bằng một hành động (ví dụ "đọc biến môi trường", "gọi model qua API"), không phải bằng cách diễn giải lại tên tệp.</w:t>
       </w:r>
     </w:p>
     <w:tbl>
@@ -633,8 +823,8 @@
         </w:tblBorders>
       </w:tblPr>
       <w:tblGrid>
-        <w:gridCol w:w="3200"/>
-        <w:gridCol w:w="6300"/>
+        <w:gridCol w:w="3300"/>
+        <w:gridCol w:w="6200"/>
       </w:tblGrid>
       <w:tr>
         <w:trPr>
@@ -642,7 +832,7 @@
         </w:trPr>
         <w:tc>
           <w:tcPr>
-            <w:tcW w:type="dxa" w:w="3200"/>
+            <w:tcW w:type="dxa" w:w="3300"/>
             <w:shd w:fill="DCEBEA" w:val="clear"/>
             <w:tcMar>
               <w:top w:type="dxa" w:w="80"/>
@@ -668,7 +858,7 @@
         </w:tc>
         <w:tc>
           <w:tcPr>
-            <w:tcW w:type="dxa" w:w="6300"/>
+            <w:tcW w:type="dxa" w:w="6200"/>
             <w:shd w:fill="DCEBEA" w:val="clear"/>
             <w:tcMar>
               <w:top w:type="dxa" w:w="80"/>
@@ -699,7 +889,7 @@
         </w:trPr>
         <w:tc>
           <w:tcPr>
-            <w:tcW w:type="dxa" w:w="3200"/>
+            <w:tcW w:type="dxa" w:w="3300"/>
             <w:tcMar>
               <w:top w:type="dxa" w:w="80"/>
               <w:left w:type="dxa" w:w="100"/>
@@ -724,7 +914,7 @@
         </w:tc>
         <w:tc>
           <w:tcPr>
-            <w:tcW w:type="dxa" w:w="6300"/>
+            <w:tcW w:type="dxa" w:w="6200"/>
             <w:tcMar>
               <w:top w:type="dxa" w:w="80"/>
               <w:left w:type="dxa" w:w="100"/>
@@ -754,7 +944,7 @@
         </w:trPr>
         <w:tc>
           <w:tcPr>
-            <w:tcW w:type="dxa" w:w="3200"/>
+            <w:tcW w:type="dxa" w:w="3300"/>
             <w:shd w:fill="F2F7F6" w:val="clear"/>
             <w:tcMar>
               <w:top w:type="dxa" w:w="80"/>
@@ -780,7 +970,7 @@
         </w:tc>
         <w:tc>
           <w:tcPr>
-            <w:tcW w:type="dxa" w:w="6300"/>
+            <w:tcW w:type="dxa" w:w="6200"/>
             <w:shd w:fill="F2F7F6" w:val="clear"/>
             <w:tcMar>
               <w:top w:type="dxa" w:w="80"/>
@@ -811,7 +1001,7 @@
         </w:trPr>
         <w:tc>
           <w:tcPr>
-            <w:tcW w:type="dxa" w:w="3200"/>
+            <w:tcW w:type="dxa" w:w="3300"/>
             <w:tcMar>
               <w:top w:type="dxa" w:w="80"/>
               <w:left w:type="dxa" w:w="100"/>
@@ -836,7 +1026,7 @@
         </w:tc>
         <w:tc>
           <w:tcPr>
-            <w:tcW w:type="dxa" w:w="6300"/>
+            <w:tcW w:type="dxa" w:w="6200"/>
             <w:tcMar>
               <w:top w:type="dxa" w:w="80"/>
               <w:left w:type="dxa" w:w="100"/>
@@ -866,7 +1056,7 @@
         </w:trPr>
         <w:tc>
           <w:tcPr>
-            <w:tcW w:type="dxa" w:w="3200"/>
+            <w:tcW w:type="dxa" w:w="3300"/>
             <w:shd w:fill="F2F7F6" w:val="clear"/>
             <w:tcMar>
               <w:top w:type="dxa" w:w="80"/>
@@ -892,7 +1082,7 @@
         </w:tc>
         <w:tc>
           <w:tcPr>
-            <w:tcW w:type="dxa" w:w="6300"/>
+            <w:tcW w:type="dxa" w:w="6200"/>
             <w:shd w:fill="F2F7F6" w:val="clear"/>
             <w:tcMar>
               <w:top w:type="dxa" w:w="80"/>
@@ -923,7 +1113,7 @@
         </w:trPr>
         <w:tc>
           <w:tcPr>
-            <w:tcW w:type="dxa" w:w="3200"/>
+            <w:tcW w:type="dxa" w:w="3300"/>
             <w:tcMar>
               <w:top w:type="dxa" w:w="80"/>
               <w:left w:type="dxa" w:w="100"/>
@@ -948,7 +1138,7 @@
         </w:tc>
         <w:tc>
           <w:tcPr>
-            <w:tcW w:type="dxa" w:w="6300"/>
+            <w:tcW w:type="dxa" w:w="6200"/>
             <w:tcMar>
               <w:top w:type="dxa" w:w="80"/>
               <w:left w:type="dxa" w:w="100"/>
@@ -978,7 +1168,7 @@
         </w:trPr>
         <w:tc>
           <w:tcPr>
-            <w:tcW w:type="dxa" w:w="3200"/>
+            <w:tcW w:type="dxa" w:w="3300"/>
             <w:shd w:fill="F2F7F6" w:val="clear"/>
             <w:tcMar>
               <w:top w:type="dxa" w:w="80"/>
@@ -1004,7 +1194,7 @@
         </w:tc>
         <w:tc>
           <w:tcPr>
-            <w:tcW w:type="dxa" w:w="6300"/>
+            <w:tcW w:type="dxa" w:w="6200"/>
             <w:shd w:fill="F2F7F6" w:val="clear"/>
             <w:tcMar>
               <w:top w:type="dxa" w:w="80"/>
@@ -1035,7 +1225,7 @@
         </w:trPr>
         <w:tc>
           <w:tcPr>
-            <w:tcW w:type="dxa" w:w="3200"/>
+            <w:tcW w:type="dxa" w:w="3300"/>
             <w:tcMar>
               <w:top w:type="dxa" w:w="80"/>
               <w:left w:type="dxa" w:w="100"/>
@@ -1060,7 +1250,7 @@
         </w:tc>
         <w:tc>
           <w:tcPr>
-            <w:tcW w:type="dxa" w:w="6300"/>
+            <w:tcW w:type="dxa" w:w="6200"/>
             <w:tcMar>
               <w:top w:type="dxa" w:w="80"/>
               <w:left w:type="dxa" w:w="100"/>
@@ -1177,7 +1367,7 @@
           <w:sz w:val="20"/>
           <w:szCs w:val="20"/>
         </w:rPr>
-        <w:t xml:space="preserve">__________________________________________________________________</w:t>
+        <w:t xml:space="preserve">_____________________________________________________________________</w:t>
       </w:r>
     </w:p>
     <w:p>
@@ -1222,7 +1412,7 @@
           <w:sz w:val="21"/>
           <w:szCs w:val="21"/>
         </w:rPr>
-        <w:t xml:space="preserve">.)</w:t>
+        <w:t xml:space="preserve"> — tốc độ không liên quan gì tới nội dung khóa cache.)</w:t>
       </w:r>
     </w:p>
     <w:p>
@@ -1236,7 +1426,7 @@
           <w:sz w:val="20"/>
           <w:szCs w:val="20"/>
         </w:rPr>
-        <w:t xml:space="preserve">__________________________________________________________________</w:t>
+        <w:t xml:space="preserve">_____________________________________________________________________</w:t>
       </w:r>
     </w:p>
     <w:p>
@@ -1250,19 +1440,29 @@
           <w:sz w:val="20"/>
           <w:szCs w:val="20"/>
         </w:rPr>
-        <w:t xml:space="preserve">__________________________________________________________________</w:t>
-      </w:r>
-    </w:p>
-    <w:p>
-      <w:pPr>
-        <w:spacing w:after="140" w:line="300"/>
-      </w:pPr>
-      <w:r>
-        <w:rPr>
-          <w:rFonts w:ascii="Calibri" w:cs="Calibri" w:eastAsia="Calibri" w:hAnsi="Calibri"/>
-          <w:color w:val="1B1F1F"/>
-          <w:sz w:val="21"/>
-          <w:szCs w:val="21"/>
+        <w:t xml:space="preserve">_____________________________________________________________________</w:t>
+      </w:r>
+    </w:p>
+    <w:p>
+      <w:pPr>
+        <w:pBdr>
+          <w:top w:val="single" w:color="FBF2E1" w:sz="2" w:space="4"/>
+          <w:bottom w:val="single" w:color="FBF2E1" w:sz="2" w:space="4"/>
+          <w:left w:val="single" w:color="B8860B" w:sz="24" w:space="8"/>
+          <w:right w:val="single" w:color="FBF2E1" w:sz="2" w:space="4"/>
+        </w:pBdr>
+        <w:shd w:fill="FBF2E1" w:val="clear"/>
+        <w:spacing w:after="200" w:before="100" w:line="300"/>
+        <w:ind w:left="100"/>
+      </w:pPr>
+      <w:r>
+        <w:rPr>
+          <w:rFonts w:ascii="Calibri" w:cs="Calibri" w:eastAsia="Calibri" w:hAnsi="Calibri"/>
+          <w:i/>
+          <w:iCs/>
+          <w:color w:val="1B1F1F"/>
+          <w:sz w:val="20"/>
+          <w:szCs w:val="20"/>
         </w:rPr>
         <w:t xml:space="preserve">Chuyện gì xảy ra nếu bỏ hai trường đó, và vì sao </w:t>
       </w:r>
@@ -1271,20 +1471,35 @@
           <w:rFonts w:ascii="Calibri" w:cs="Calibri" w:eastAsia="Calibri" w:hAnsi="Calibri"/>
           <w:b/>
           <w:bCs/>
-          <w:color w:val="1B1F1F"/>
-          <w:sz w:val="21"/>
-          <w:szCs w:val="21"/>
+          <w:i/>
+          <w:iCs/>
+          <w:color w:val="1B1F1F"/>
+          <w:sz w:val="20"/>
+          <w:szCs w:val="20"/>
         </w:rPr>
         <w:t xml:space="preserve">không ai phát hiện ra</w:t>
       </w:r>
       <w:r>
         <w:rPr>
           <w:rFonts w:ascii="Calibri" w:cs="Calibri" w:eastAsia="Calibri" w:hAnsi="Calibri"/>
-          <w:color w:val="1B1F1F"/>
-          <w:sz w:val="21"/>
-          <w:szCs w:val="21"/>
-        </w:rPr>
-        <w:t xml:space="preserve">?</w:t>
+          <w:i/>
+          <w:iCs/>
+          <w:color w:val="1B1F1F"/>
+          <w:sz w:val="20"/>
+          <w:szCs w:val="20"/>
+        </w:rPr>
+        <w:t xml:space="preserve">? </w:t>
+      </w:r>
+      <w:r>
+        <w:rPr>
+          <w:rFonts w:ascii="Calibri" w:cs="Calibri" w:eastAsia="Calibri" w:hAnsi="Calibri"/>
+          <w:i/>
+          <w:iCs/>
+          <w:color w:val="1B1F1F"/>
+          <w:sz w:val="20"/>
+          <w:szCs w:val="20"/>
+        </w:rPr>
+        <w:t xml:space="preserve">(Gợi ý cách nghĩ: hai nhóm dùng hai cấu hình khác nhau nhưng tra cùng một khóa cache thì chuyện gì xảy ra với kết quả của họ?)</w:t>
       </w:r>
     </w:p>
     <w:p>
@@ -1298,7 +1513,7 @@
           <w:sz w:val="20"/>
           <w:szCs w:val="20"/>
         </w:rPr>
-        <w:t xml:space="preserve">__________________________________________________________________</w:t>
+        <w:t xml:space="preserve">_____________________________________________________________________</w:t>
       </w:r>
     </w:p>
     <w:p>
@@ -1343,6 +1558,40 @@
           <w:szCs w:val="21"/>
         </w:rPr>
         <w:t xml:space="preserve">`___:___` → `___:___`</w:t>
+      </w:r>
+    </w:p>
+    <w:p>
+      <w:pPr>
+        <w:spacing w:after="140" w:line="300"/>
+      </w:pPr>
+      <w:r>
+        <w:rPr>
+          <w:rFonts w:ascii="Calibri" w:cs="Calibri" w:eastAsia="Calibri" w:hAnsi="Calibri"/>
+          <w:color w:val="1B1F1F"/>
+          <w:sz w:val="21"/>
+          <w:szCs w:val="21"/>
+        </w:rPr>
+        <w:t xml:space="preserve">Cùng một model, đo qua hai cấu hình hạ tầng (Ollama/L, vLLM/S) ở hai mức nhiệt độ. Mục tiêu không phải để biết "cấu hình nào nhanh hơn" — mà để tự tay đo ra vì sao một ứng dụng AI cần </w:t>
+      </w:r>
+      <w:r>
+        <w:rPr>
+          <w:rFonts w:ascii="Calibri" w:cs="Calibri" w:eastAsia="Calibri" w:hAnsi="Calibri"/>
+          <w:b/>
+          <w:bCs/>
+          <w:color w:val="1B1F1F"/>
+          <w:sz w:val="21"/>
+          <w:szCs w:val="21"/>
+        </w:rPr>
+        <w:t xml:space="preserve">tham số khác nhau cho từng tác vụ</w:t>
+      </w:r>
+      <w:r>
+        <w:rPr>
+          <w:rFonts w:ascii="Calibri" w:cs="Calibri" w:eastAsia="Calibri" w:hAnsi="Calibri"/>
+          <w:color w:val="1B1F1F"/>
+          <w:sz w:val="21"/>
+          <w:szCs w:val="21"/>
+        </w:rPr>
+        <w:t xml:space="preserve">, thay vì nghe giảng viên nói suông.</w:t>
       </w:r>
     </w:p>
     <w:p>
@@ -1411,7 +1660,7 @@
     </w:p>
     <w:tbl>
       <w:tblPr>
-        <w:tblW w:type="dxa" w:w="9200"/>
+        <w:tblW w:type="dxa" w:w="9300"/>
         <w:tblBorders>
           <w:top w:val="single" w:color="BFD3D2" w:sz="4"/>
           <w:left w:val="single" w:color="BFD3D2" w:sz="4"/>
@@ -1422,11 +1671,11 @@
         </w:tblBorders>
       </w:tblPr>
       <w:tblGrid>
-        <w:gridCol w:w="2400"/>
+        <w:gridCol w:w="3200"/>
+        <w:gridCol w:w="1300"/>
+        <w:gridCol w:w="1200"/>
         <w:gridCol w:w="1400"/>
-        <w:gridCol w:w="1300"/>
-        <w:gridCol w:w="1500"/>
-        <w:gridCol w:w="2600"/>
+        <w:gridCol w:w="2200"/>
       </w:tblGrid>
       <w:tr>
         <w:trPr>
@@ -1434,7 +1683,7 @@
         </w:trPr>
         <w:tc>
           <w:tcPr>
-            <w:tcW w:type="dxa" w:w="2400"/>
+            <w:tcW w:type="dxa" w:w="3200"/>
             <w:shd w:fill="DCEBEA" w:val="clear"/>
             <w:tcMar>
               <w:top w:type="dxa" w:w="80"/>
@@ -1460,7 +1709,7 @@
         </w:tc>
         <w:tc>
           <w:tcPr>
-            <w:tcW w:type="dxa" w:w="1400"/>
+            <w:tcW w:type="dxa" w:w="1300"/>
             <w:shd w:fill="DCEBEA" w:val="clear"/>
             <w:tcMar>
               <w:top w:type="dxa" w:w="80"/>
@@ -1486,7 +1735,7 @@
         </w:tc>
         <w:tc>
           <w:tcPr>
-            <w:tcW w:type="dxa" w:w="1300"/>
+            <w:tcW w:type="dxa" w:w="1200"/>
             <w:shd w:fill="DCEBEA" w:val="clear"/>
             <w:tcMar>
               <w:top w:type="dxa" w:w="80"/>
@@ -1512,7 +1761,7 @@
         </w:tc>
         <w:tc>
           <w:tcPr>
-            <w:tcW w:type="dxa" w:w="1500"/>
+            <w:tcW w:type="dxa" w:w="1400"/>
             <w:shd w:fill="DCEBEA" w:val="clear"/>
             <w:tcMar>
               <w:top w:type="dxa" w:w="80"/>
@@ -1538,7 +1787,7 @@
         </w:tc>
         <w:tc>
           <w:tcPr>
-            <w:tcW w:type="dxa" w:w="2600"/>
+            <w:tcW w:type="dxa" w:w="2200"/>
             <w:shd w:fill="DCEBEA" w:val="clear"/>
             <w:tcMar>
               <w:top w:type="dxa" w:w="80"/>
@@ -1569,7 +1818,7 @@
         </w:trPr>
         <w:tc>
           <w:tcPr>
-            <w:tcW w:type="dxa" w:w="2400"/>
+            <w:tcW w:type="dxa" w:w="3200"/>
             <w:tcMar>
               <w:top w:type="dxa" w:w="80"/>
               <w:left w:type="dxa" w:w="100"/>
@@ -1594,7 +1843,7 @@
         </w:tc>
         <w:tc>
           <w:tcPr>
-            <w:tcW w:type="dxa" w:w="1400"/>
+            <w:tcW w:type="dxa" w:w="1300"/>
             <w:tcMar>
               <w:top w:type="dxa" w:w="80"/>
               <w:left w:type="dxa" w:w="100"/>
@@ -1619,7 +1868,7 @@
         </w:tc>
         <w:tc>
           <w:tcPr>
-            <w:tcW w:type="dxa" w:w="1300"/>
+            <w:tcW w:type="dxa" w:w="1200"/>
             <w:tcMar>
               <w:top w:type="dxa" w:w="80"/>
               <w:left w:type="dxa" w:w="100"/>
@@ -1644,7 +1893,7 @@
         </w:tc>
         <w:tc>
           <w:tcPr>
-            <w:tcW w:type="dxa" w:w="1500"/>
+            <w:tcW w:type="dxa" w:w="1400"/>
             <w:tcMar>
               <w:top w:type="dxa" w:w="80"/>
               <w:left w:type="dxa" w:w="100"/>
@@ -1669,7 +1918,7 @@
         </w:tc>
         <w:tc>
           <w:tcPr>
-            <w:tcW w:type="dxa" w:w="2600"/>
+            <w:tcW w:type="dxa" w:w="2200"/>
             <w:tcMar>
               <w:top w:type="dxa" w:w="80"/>
               <w:left w:type="dxa" w:w="100"/>
@@ -1699,7 +1948,7 @@
         </w:trPr>
         <w:tc>
           <w:tcPr>
-            <w:tcW w:type="dxa" w:w="2400"/>
+            <w:tcW w:type="dxa" w:w="3200"/>
             <w:shd w:fill="F2F7F6" w:val="clear"/>
             <w:tcMar>
               <w:top w:type="dxa" w:w="80"/>
@@ -1725,7 +1974,7 @@
         </w:tc>
         <w:tc>
           <w:tcPr>
-            <w:tcW w:type="dxa" w:w="1400"/>
+            <w:tcW w:type="dxa" w:w="1300"/>
             <w:shd w:fill="F2F7F6" w:val="clear"/>
             <w:tcMar>
               <w:top w:type="dxa" w:w="80"/>
@@ -1751,7 +2000,7 @@
         </w:tc>
         <w:tc>
           <w:tcPr>
-            <w:tcW w:type="dxa" w:w="1300"/>
+            <w:tcW w:type="dxa" w:w="1200"/>
             <w:shd w:fill="F2F7F6" w:val="clear"/>
             <w:tcMar>
               <w:top w:type="dxa" w:w="80"/>
@@ -1777,7 +2026,7 @@
         </w:tc>
         <w:tc>
           <w:tcPr>
-            <w:tcW w:type="dxa" w:w="1500"/>
+            <w:tcW w:type="dxa" w:w="1400"/>
             <w:shd w:fill="F2F7F6" w:val="clear"/>
             <w:tcMar>
               <w:top w:type="dxa" w:w="80"/>
@@ -1803,7 +2052,7 @@
         </w:tc>
         <w:tc>
           <w:tcPr>
-            <w:tcW w:type="dxa" w:w="2600"/>
+            <w:tcW w:type="dxa" w:w="2200"/>
             <w:shd w:fill="F2F7F6" w:val="clear"/>
             <w:tcMar>
               <w:top w:type="dxa" w:w="80"/>
@@ -1834,7 +2083,7 @@
         </w:trPr>
         <w:tc>
           <w:tcPr>
-            <w:tcW w:type="dxa" w:w="2400"/>
+            <w:tcW w:type="dxa" w:w="3200"/>
             <w:tcMar>
               <w:top w:type="dxa" w:w="80"/>
               <w:left w:type="dxa" w:w="100"/>
@@ -1859,7 +2108,7 @@
         </w:tc>
         <w:tc>
           <w:tcPr>
-            <w:tcW w:type="dxa" w:w="1400"/>
+            <w:tcW w:type="dxa" w:w="1300"/>
             <w:tcMar>
               <w:top w:type="dxa" w:w="80"/>
               <w:left w:type="dxa" w:w="100"/>
@@ -1884,7 +2133,7 @@
         </w:tc>
         <w:tc>
           <w:tcPr>
-            <w:tcW w:type="dxa" w:w="1300"/>
+            <w:tcW w:type="dxa" w:w="1200"/>
             <w:tcMar>
               <w:top w:type="dxa" w:w="80"/>
               <w:left w:type="dxa" w:w="100"/>
@@ -1909,7 +2158,7 @@
         </w:tc>
         <w:tc>
           <w:tcPr>
-            <w:tcW w:type="dxa" w:w="1500"/>
+            <w:tcW w:type="dxa" w:w="1400"/>
             <w:tcMar>
               <w:top w:type="dxa" w:w="80"/>
               <w:left w:type="dxa" w:w="100"/>
@@ -1934,7 +2183,7 @@
         </w:tc>
         <w:tc>
           <w:tcPr>
-            <w:tcW w:type="dxa" w:w="2600"/>
+            <w:tcW w:type="dxa" w:w="2200"/>
             <w:tcMar>
               <w:top w:type="dxa" w:w="80"/>
               <w:left w:type="dxa" w:w="100"/>
@@ -1964,7 +2213,7 @@
         </w:trPr>
         <w:tc>
           <w:tcPr>
-            <w:tcW w:type="dxa" w:w="2400"/>
+            <w:tcW w:type="dxa" w:w="3200"/>
             <w:shd w:fill="F2F7F6" w:val="clear"/>
             <w:tcMar>
               <w:top w:type="dxa" w:w="80"/>
@@ -1990,7 +2239,7 @@
         </w:tc>
         <w:tc>
           <w:tcPr>
-            <w:tcW w:type="dxa" w:w="1400"/>
+            <w:tcW w:type="dxa" w:w="1300"/>
             <w:shd w:fill="F2F7F6" w:val="clear"/>
             <w:tcMar>
               <w:top w:type="dxa" w:w="80"/>
@@ -2016,7 +2265,7 @@
         </w:tc>
         <w:tc>
           <w:tcPr>
-            <w:tcW w:type="dxa" w:w="1300"/>
+            <w:tcW w:type="dxa" w:w="1200"/>
             <w:shd w:fill="F2F7F6" w:val="clear"/>
             <w:tcMar>
               <w:top w:type="dxa" w:w="80"/>
@@ -2042,7 +2291,7 @@
         </w:tc>
         <w:tc>
           <w:tcPr>
-            <w:tcW w:type="dxa" w:w="1500"/>
+            <w:tcW w:type="dxa" w:w="1400"/>
             <w:shd w:fill="F2F7F6" w:val="clear"/>
             <w:tcMar>
               <w:top w:type="dxa" w:w="80"/>
@@ -2068,7 +2317,7 @@
         </w:tc>
         <w:tc>
           <w:tcPr>
-            <w:tcW w:type="dxa" w:w="2600"/>
+            <w:tcW w:type="dxa" w:w="2200"/>
             <w:shd w:fill="F2F7F6" w:val="clear"/>
             <w:tcMar>
               <w:top w:type="dxa" w:w="80"/>
@@ -2156,119 +2405,7 @@
           <w:sz w:val="20"/>
           <w:szCs w:val="20"/>
         </w:rPr>
-        <w:t xml:space="preserve">__________________________________________________________________</w:t>
-      </w:r>
-    </w:p>
-    <w:p>
-      <w:pPr>
-        <w:spacing w:after="140" w:line="300"/>
-      </w:pPr>
-      <w:r>
-        <w:rPr>
-          <w:rFonts w:ascii="Calibri" w:cs="Calibri" w:eastAsia="Calibri" w:hAnsi="Calibri"/>
-          <w:color w:val="1B1F1F"/>
-          <w:sz w:val="21"/>
-          <w:szCs w:val="21"/>
-        </w:rPr>
-        <w:t xml:space="preserve">Còn với </w:t>
-      </w:r>
-      <w:r>
-        <w:rPr>
-          <w:rFonts w:ascii="Calibri" w:cs="Calibri" w:eastAsia="Calibri" w:hAnsi="Calibri"/>
-          <w:b/>
-          <w:bCs/>
-          <w:color w:val="1B1F1F"/>
-          <w:sz w:val="21"/>
-          <w:szCs w:val="21"/>
-        </w:rPr>
-        <w:t xml:space="preserve">soạn phản hồi</w:t>
-      </w:r>
-      <w:r>
-        <w:rPr>
-          <w:rFonts w:ascii="Calibri" w:cs="Calibri" w:eastAsia="Calibri" w:hAnsi="Calibri"/>
-          <w:color w:val="1B1F1F"/>
-          <w:sz w:val="21"/>
-          <w:szCs w:val="21"/>
-        </w:rPr>
-        <w:t xml:space="preserve"> thì sao? Vì sao khác?</w:t>
-      </w:r>
-    </w:p>
-    <w:p>
-      <w:pPr>
-        <w:spacing w:after="140" w:line="300"/>
-      </w:pPr>
-      <w:r>
-        <w:rPr>
-          <w:rFonts w:ascii="Consolas" w:cs="Consolas" w:eastAsia="Consolas" w:hAnsi="Consolas"/>
-          <w:color w:val="0B3F41"/>
-          <w:sz w:val="20"/>
-          <w:szCs w:val="20"/>
-        </w:rPr>
-        <w:t xml:space="preserve">__________________________________________________________________</w:t>
-      </w:r>
-    </w:p>
-    <w:p>
-      <w:pPr>
-        <w:spacing w:after="140" w:line="300"/>
-      </w:pPr>
-      <w:r>
-        <w:rPr>
-          <w:rFonts w:ascii="Calibri" w:cs="Calibri" w:eastAsia="Calibri" w:hAnsi="Calibri"/>
-          <w:color w:val="1B1F1F"/>
-          <w:sz w:val="21"/>
-          <w:szCs w:val="21"/>
-        </w:rPr>
-        <w:t xml:space="preserve">Mở </w:t>
-      </w:r>
-      <w:r>
-        <w:rPr>
-          <w:rFonts w:ascii="Consolas" w:cs="Consolas" w:eastAsia="Consolas" w:hAnsi="Consolas"/>
-          <w:color w:val="0B3F41"/>
-          <w:sz w:val="20"/>
-          <w:szCs w:val="20"/>
-        </w:rPr>
-        <w:t xml:space="preserve">src/config.py</w:t>
-      </w:r>
-      <w:r>
-        <w:rPr>
-          <w:rFonts w:ascii="Calibri" w:cs="Calibri" w:eastAsia="Calibri" w:hAnsi="Calibri"/>
-          <w:color w:val="1B1F1F"/>
-          <w:sz w:val="21"/>
-          <w:szCs w:val="21"/>
-        </w:rPr>
-        <w:t xml:space="preserve">, tìm </w:t>
-      </w:r>
-      <w:r>
-        <w:rPr>
-          <w:rFonts w:ascii="Consolas" w:cs="Consolas" w:eastAsia="Consolas" w:hAnsi="Consolas"/>
-          <w:color w:val="0B3F41"/>
-          <w:sz w:val="20"/>
-          <w:szCs w:val="20"/>
-        </w:rPr>
-        <w:t xml:space="preserve">TASK_PARAMS</w:t>
-      </w:r>
-      <w:r>
-        <w:rPr>
-          <w:rFonts w:ascii="Calibri" w:cs="Calibri" w:eastAsia="Calibri" w:hAnsi="Calibri"/>
-          <w:color w:val="1B1F1F"/>
-          <w:sz w:val="21"/>
-          <w:szCs w:val="21"/>
-        </w:rPr>
-        <w:t xml:space="preserve">. Nhóm có đồng ý với các giá trị ở đó không? Nếu đổi, đổi cái gì và vì sao?</w:t>
-      </w:r>
-    </w:p>
-    <w:p>
-      <w:pPr>
-        <w:spacing w:after="140" w:line="300"/>
-      </w:pPr>
-      <w:r>
-        <w:rPr>
-          <w:rFonts w:ascii="Consolas" w:cs="Consolas" w:eastAsia="Consolas" w:hAnsi="Consolas"/>
-          <w:color w:val="0B3F41"/>
-          <w:sz w:val="20"/>
-          <w:szCs w:val="20"/>
-        </w:rPr>
-        <w:t xml:space="preserve">__________________________________________________________________</w:t>
+        <w:t xml:space="preserve">_____________________________________________________________________</w:t>
       </w:r>
     </w:p>
     <w:p>
@@ -2292,6 +2429,143 @@
           <w:sz w:val="20"/>
           <w:szCs w:val="20"/>
         </w:rPr>
+        <w:t xml:space="preserve">Còn với </w:t>
+      </w:r>
+      <w:r>
+        <w:rPr>
+          <w:rFonts w:ascii="Calibri" w:cs="Calibri" w:eastAsia="Calibri" w:hAnsi="Calibri"/>
+          <w:b/>
+          <w:bCs/>
+          <w:i/>
+          <w:iCs/>
+          <w:color w:val="1B1F1F"/>
+          <w:sz w:val="20"/>
+          <w:szCs w:val="20"/>
+        </w:rPr>
+        <w:t xml:space="preserve">soạn phản hồi</w:t>
+      </w:r>
+      <w:r>
+        <w:rPr>
+          <w:rFonts w:ascii="Calibri" w:cs="Calibri" w:eastAsia="Calibri" w:hAnsi="Calibri"/>
+          <w:i/>
+          <w:iCs/>
+          <w:color w:val="1B1F1F"/>
+          <w:sz w:val="20"/>
+          <w:szCs w:val="20"/>
+        </w:rPr>
+        <w:t xml:space="preserve"> thì sao? Vì sao khác? </w:t>
+      </w:r>
+      <w:r>
+        <w:rPr>
+          <w:rFonts w:ascii="Calibri" w:cs="Calibri" w:eastAsia="Calibri" w:hAnsi="Calibri"/>
+          <w:i/>
+          <w:iCs/>
+          <w:color w:val="1B1F1F"/>
+          <w:sz w:val="20"/>
+          <w:szCs w:val="20"/>
+        </w:rPr>
+        <w:t xml:space="preserve">(Gợi ý cách nghĩ: phân loại cần MỘT đáp án đúng lặp lại được; soạn phản hồi cần câu chữ không bị cứng nhắc lặp lại giống hệt nhau mỗi lần.)</w:t>
+      </w:r>
+    </w:p>
+    <w:p>
+      <w:pPr>
+        <w:spacing w:after="140" w:line="300"/>
+      </w:pPr>
+      <w:r>
+        <w:rPr>
+          <w:rFonts w:ascii="Consolas" w:cs="Consolas" w:eastAsia="Consolas" w:hAnsi="Consolas"/>
+          <w:color w:val="0B3F41"/>
+          <w:sz w:val="20"/>
+          <w:szCs w:val="20"/>
+        </w:rPr>
+        <w:t xml:space="preserve">_____________________________________________________________________</w:t>
+      </w:r>
+    </w:p>
+    <w:p>
+      <w:pPr>
+        <w:spacing w:after="140" w:line="300"/>
+      </w:pPr>
+      <w:r>
+        <w:rPr>
+          <w:rFonts w:ascii="Calibri" w:cs="Calibri" w:eastAsia="Calibri" w:hAnsi="Calibri"/>
+          <w:color w:val="1B1F1F"/>
+          <w:sz w:val="21"/>
+          <w:szCs w:val="21"/>
+        </w:rPr>
+        <w:t xml:space="preserve">Mở </w:t>
+      </w:r>
+      <w:r>
+        <w:rPr>
+          <w:rFonts w:ascii="Consolas" w:cs="Consolas" w:eastAsia="Consolas" w:hAnsi="Consolas"/>
+          <w:color w:val="0B3F41"/>
+          <w:sz w:val="20"/>
+          <w:szCs w:val="20"/>
+        </w:rPr>
+        <w:t xml:space="preserve">src/config.py</w:t>
+      </w:r>
+      <w:r>
+        <w:rPr>
+          <w:rFonts w:ascii="Calibri" w:cs="Calibri" w:eastAsia="Calibri" w:hAnsi="Calibri"/>
+          <w:color w:val="1B1F1F"/>
+          <w:sz w:val="21"/>
+          <w:szCs w:val="21"/>
+        </w:rPr>
+        <w:t xml:space="preserve">, tìm </w:t>
+      </w:r>
+      <w:r>
+        <w:rPr>
+          <w:rFonts w:ascii="Consolas" w:cs="Consolas" w:eastAsia="Consolas" w:hAnsi="Consolas"/>
+          <w:color w:val="0B3F41"/>
+          <w:sz w:val="20"/>
+          <w:szCs w:val="20"/>
+        </w:rPr>
+        <w:t xml:space="preserve">TASK_PARAMS</w:t>
+      </w:r>
+      <w:r>
+        <w:rPr>
+          <w:rFonts w:ascii="Calibri" w:cs="Calibri" w:eastAsia="Calibri" w:hAnsi="Calibri"/>
+          <w:color w:val="1B1F1F"/>
+          <w:sz w:val="21"/>
+          <w:szCs w:val="21"/>
+        </w:rPr>
+        <w:t xml:space="preserve">. Nhóm có đồng ý với các giá trị ở đó không? Nếu đổi, đổi cái gì và vì sao?</w:t>
+      </w:r>
+    </w:p>
+    <w:p>
+      <w:pPr>
+        <w:spacing w:after="140" w:line="300"/>
+      </w:pPr>
+      <w:r>
+        <w:rPr>
+          <w:rFonts w:ascii="Consolas" w:cs="Consolas" w:eastAsia="Consolas" w:hAnsi="Consolas"/>
+          <w:color w:val="0B3F41"/>
+          <w:sz w:val="20"/>
+          <w:szCs w:val="20"/>
+        </w:rPr>
+        <w:t xml:space="preserve">_____________________________________________________________________</w:t>
+      </w:r>
+    </w:p>
+    <w:p>
+      <w:pPr>
+        <w:pBdr>
+          <w:top w:val="single" w:color="FBF2E1" w:sz="2" w:space="4"/>
+          <w:bottom w:val="single" w:color="FBF2E1" w:sz="2" w:space="4"/>
+          <w:left w:val="single" w:color="B8860B" w:sz="24" w:space="8"/>
+          <w:right w:val="single" w:color="FBF2E1" w:sz="2" w:space="4"/>
+        </w:pBdr>
+        <w:shd w:fill="FBF2E1" w:val="clear"/>
+        <w:spacing w:after="200" w:before="100" w:line="300"/>
+        <w:ind w:left="100"/>
+      </w:pPr>
+      <w:r>
+        <w:rPr>
+          <w:rFonts w:ascii="Calibri" w:cs="Calibri" w:eastAsia="Calibri" w:hAnsi="Calibri"/>
+          <w:i/>
+          <w:iCs/>
+          <w:color w:val="1B1F1F"/>
+          <w:sz w:val="20"/>
+          <w:szCs w:val="20"/>
+        </w:rPr>
         <w:t xml:space="preserve">Kết luận cần chốt: </w:t>
       </w:r>
       <w:r>
@@ -2371,61 +2645,92 @@
     </w:p>
     <w:p>
       <w:pPr>
-        <w:spacing w:after="140" w:line="300"/>
-      </w:pPr>
-      <w:r>
-        <w:rPr>
-          <w:rFonts w:ascii="Calibri" w:cs="Calibri" w:eastAsia="Calibri" w:hAnsi="Calibri"/>
-          <w:color w:val="1B1F1F"/>
-          <w:sz w:val="21"/>
-          <w:szCs w:val="21"/>
-        </w:rPr>
-        <w:t xml:space="preserve">Với </w:t>
-      </w:r>
+        <w:pBdr>
+          <w:top w:val="single" w:color="FBF2E1" w:sz="2" w:space="4"/>
+          <w:bottom w:val="single" w:color="FBF2E1" w:sz="2" w:space="4"/>
+          <w:left w:val="single" w:color="B8860B" w:sz="24" w:space="8"/>
+          <w:right w:val="single" w:color="FBF2E1" w:sz="2" w:space="4"/>
+        </w:pBdr>
+        <w:shd w:fill="FBF2E1" w:val="clear"/>
+        <w:spacing w:after="200" w:before="100" w:line="300"/>
+        <w:ind w:left="100"/>
+      </w:pPr>
       <w:r>
         <w:rPr>
           <w:rFonts w:ascii="Calibri" w:cs="Calibri" w:eastAsia="Calibri" w:hAnsi="Calibri"/>
           <w:b/>
           <w:bCs/>
-          <w:color w:val="1B1F1F"/>
-          <w:sz w:val="21"/>
-          <w:szCs w:val="21"/>
-        </w:rPr>
-        <w:t xml:space="preserve">mỗi</w:t>
-      </w:r>
-      <w:r>
-        <w:rPr>
-          <w:rFonts w:ascii="Calibri" w:cs="Calibri" w:eastAsia="Calibri" w:hAnsi="Calibri"/>
-          <w:color w:val="1B1F1F"/>
-          <w:sz w:val="21"/>
-          <w:szCs w:val="21"/>
-        </w:rPr>
-        <w:t xml:space="preserve"> thành phần, phần </w:t>
-      </w:r>
-      <w:r>
-        <w:rPr>
-          <w:rFonts w:ascii="Calibri" w:cs="Calibri" w:eastAsia="Calibri" w:hAnsi="Calibri"/>
           <w:i/>
           <w:iCs/>
           <w:color w:val="1B1F1F"/>
-          <w:sz w:val="21"/>
-          <w:szCs w:val="21"/>
-        </w:rPr>
-        <w:t xml:space="preserve">phương án dự phòng</w:t>
-      </w:r>
-      <w:r>
-        <w:rPr>
-          <w:rFonts w:ascii="Calibri" w:cs="Calibri" w:eastAsia="Calibri" w:hAnsi="Calibri"/>
-          <w:color w:val="1B1F1F"/>
-          <w:sz w:val="21"/>
-          <w:szCs w:val="21"/>
-        </w:rPr>
-        <w:t xml:space="preserve"> là chỗ hay bị bỏ trống nhất — giảng viên sẽ kiểm đúng cột đó.</w:t>
+          <w:sz w:val="20"/>
+          <w:szCs w:val="20"/>
+        </w:rPr>
+        <w:t xml:space="preserve">Cách nghĩ:</w:t>
+      </w:r>
+      <w:r>
+        <w:rPr>
+          <w:rFonts w:ascii="Calibri" w:cs="Calibri" w:eastAsia="Calibri" w:hAnsi="Calibri"/>
+          <w:i/>
+          <w:iCs/>
+          <w:color w:val="1B1F1F"/>
+          <w:sz w:val="20"/>
+          <w:szCs w:val="20"/>
+        </w:rPr>
+        <w:t xml:space="preserve"> Blueprint mô tả </w:t>
+      </w:r>
+      <w:r>
+        <w:rPr>
+          <w:rFonts w:ascii="Calibri" w:cs="Calibri" w:eastAsia="Calibri" w:hAnsi="Calibri"/>
+          <w:b/>
+          <w:bCs/>
+          <w:i/>
+          <w:iCs/>
+          <w:color w:val="1B1F1F"/>
+          <w:sz w:val="20"/>
+          <w:szCs w:val="20"/>
+        </w:rPr>
+        <w:t xml:space="preserve">trách nhiệm và giao diện giữa các thành phần</w:t>
+      </w:r>
+      <w:r>
+        <w:rPr>
+          <w:rFonts w:ascii="Calibri" w:cs="Calibri" w:eastAsia="Calibri" w:hAnsi="Calibri"/>
+          <w:i/>
+          <w:iCs/>
+          <w:color w:val="1B1F1F"/>
+          <w:sz w:val="20"/>
+          <w:szCs w:val="20"/>
+        </w:rPr>
+        <w:t xml:space="preserve">, không mô tả cách hiện thực bên trong — vẽ tới mức mã nguồn là lỗi thường gặp nhất ở bước này. Với </w:t>
+      </w:r>
+      <w:r>
+        <w:rPr>
+          <w:rFonts w:ascii="Calibri" w:cs="Calibri" w:eastAsia="Calibri" w:hAnsi="Calibri"/>
+          <w:b/>
+          <w:bCs/>
+          <w:i/>
+          <w:iCs/>
+          <w:color w:val="1B1F1F"/>
+          <w:sz w:val="20"/>
+          <w:szCs w:val="20"/>
+        </w:rPr>
+        <w:t xml:space="preserve">mỗi</w:t>
+      </w:r>
+      <w:r>
+        <w:rPr>
+          <w:rFonts w:ascii="Calibri" w:cs="Calibri" w:eastAsia="Calibri" w:hAnsi="Calibri"/>
+          <w:i/>
+          <w:iCs/>
+          <w:color w:val="1B1F1F"/>
+          <w:sz w:val="20"/>
+          <w:szCs w:val="20"/>
+        </w:rPr>
+        <w:t xml:space="preserve"> thành phần, tự hỏi: nếu thành phần này lỗi/không phản hồi giữa lúc đang xử lý, hệ thống làm gì tiếp theo? Đó chính là "phương án dự phòng" — cột hay bị bỏ trống nhất, giảng viên sẽ kiểm đúng cột đó. (Nếu buổi chiều có nhắc tới các mẫu thiết kế như Grounded Generation, Controlled Action, AI-Augmented Workflow, Bounded Agent — cột "dự phòng" chính là chỗ áp dụng những mẫu đó cho từng tầng.)</w:t>
       </w:r>
     </w:p>
     <w:tbl>
       <w:tblPr>
-        <w:tblW w:type="dxa" w:w="9400"/>
+        <w:tblW w:type="dxa" w:w="9500"/>
         <w:tblBorders>
           <w:top w:val="single" w:color="BFD3D2" w:sz="4"/>
           <w:left w:val="single" w:color="BFD3D2" w:sz="4"/>
@@ -2436,8 +2741,8 @@
         </w:tblBorders>
       </w:tblPr>
       <w:tblGrid>
-        <w:gridCol w:w="1600"/>
-        <w:gridCol w:w="1800"/>
+        <w:gridCol w:w="1500"/>
+        <w:gridCol w:w="2000"/>
         <w:gridCol w:w="1700"/>
         <w:gridCol w:w="1700"/>
         <w:gridCol w:w="2600"/>
@@ -2448,7 +2753,7 @@
         </w:trPr>
         <w:tc>
           <w:tcPr>
-            <w:tcW w:type="dxa" w:w="1600"/>
+            <w:tcW w:type="dxa" w:w="1500"/>
             <w:shd w:fill="DCEBEA" w:val="clear"/>
             <w:tcMar>
               <w:top w:type="dxa" w:w="80"/>
@@ -2474,7 +2779,7 @@
         </w:tc>
         <w:tc>
           <w:tcPr>
-            <w:tcW w:type="dxa" w:w="1800"/>
+            <w:tcW w:type="dxa" w:w="2000"/>
             <w:shd w:fill="DCEBEA" w:val="clear"/>
             <w:tcMar>
               <w:top w:type="dxa" w:w="80"/>
@@ -2583,7 +2888,7 @@
         </w:trPr>
         <w:tc>
           <w:tcPr>
-            <w:tcW w:type="dxa" w:w="1600"/>
+            <w:tcW w:type="dxa" w:w="1500"/>
             <w:tcMar>
               <w:top w:type="dxa" w:w="80"/>
               <w:left w:type="dxa" w:w="100"/>
@@ -2608,7 +2913,7 @@
         </w:tc>
         <w:tc>
           <w:tcPr>
-            <w:tcW w:type="dxa" w:w="1800"/>
+            <w:tcW w:type="dxa" w:w="2000"/>
             <w:tcMar>
               <w:top w:type="dxa" w:w="80"/>
               <w:left w:type="dxa" w:w="100"/>
@@ -2713,7 +3018,7 @@
         </w:trPr>
         <w:tc>
           <w:tcPr>
-            <w:tcW w:type="dxa" w:w="1600"/>
+            <w:tcW w:type="dxa" w:w="1500"/>
             <w:shd w:fill="F2F7F6" w:val="clear"/>
             <w:tcMar>
               <w:top w:type="dxa" w:w="80"/>
@@ -2739,7 +3044,7 @@
         </w:tc>
         <w:tc>
           <w:tcPr>
-            <w:tcW w:type="dxa" w:w="1800"/>
+            <w:tcW w:type="dxa" w:w="2000"/>
             <w:shd w:fill="F2F7F6" w:val="clear"/>
             <w:tcMar>
               <w:top w:type="dxa" w:w="80"/>
@@ -2848,7 +3153,7 @@
         </w:trPr>
         <w:tc>
           <w:tcPr>
-            <w:tcW w:type="dxa" w:w="1600"/>
+            <w:tcW w:type="dxa" w:w="1500"/>
             <w:tcMar>
               <w:top w:type="dxa" w:w="80"/>
               <w:left w:type="dxa" w:w="100"/>
@@ -2873,7 +3178,7 @@
         </w:tc>
         <w:tc>
           <w:tcPr>
-            <w:tcW w:type="dxa" w:w="1800"/>
+            <w:tcW w:type="dxa" w:w="2000"/>
             <w:tcMar>
               <w:top w:type="dxa" w:w="80"/>
               <w:left w:type="dxa" w:w="100"/>
@@ -2978,7 +3283,7 @@
         </w:trPr>
         <w:tc>
           <w:tcPr>
-            <w:tcW w:type="dxa" w:w="1600"/>
+            <w:tcW w:type="dxa" w:w="1500"/>
             <w:shd w:fill="F2F7F6" w:val="clear"/>
             <w:tcMar>
               <w:top w:type="dxa" w:w="80"/>
@@ -3004,7 +3309,7 @@
         </w:tc>
         <w:tc>
           <w:tcPr>
-            <w:tcW w:type="dxa" w:w="1800"/>
+            <w:tcW w:type="dxa" w:w="2000"/>
             <w:shd w:fill="F2F7F6" w:val="clear"/>
             <w:tcMar>
               <w:top w:type="dxa" w:w="80"/>
@@ -3113,7 +3418,7 @@
         </w:trPr>
         <w:tc>
           <w:tcPr>
-            <w:tcW w:type="dxa" w:w="1600"/>
+            <w:tcW w:type="dxa" w:w="1500"/>
             <w:tcMar>
               <w:top w:type="dxa" w:w="80"/>
               <w:left w:type="dxa" w:w="100"/>
@@ -3138,7 +3443,7 @@
         </w:tc>
         <w:tc>
           <w:tcPr>
-            <w:tcW w:type="dxa" w:w="1800"/>
+            <w:tcW w:type="dxa" w:w="2000"/>
             <w:tcMar>
               <w:top w:type="dxa" w:w="80"/>
               <w:left w:type="dxa" w:w="100"/>
@@ -3243,7 +3548,7 @@
         </w:trPr>
         <w:tc>
           <w:tcPr>
-            <w:tcW w:type="dxa" w:w="1600"/>
+            <w:tcW w:type="dxa" w:w="1500"/>
             <w:shd w:fill="F2F7F6" w:val="clear"/>
             <w:tcMar>
               <w:top w:type="dxa" w:w="80"/>
@@ -3269,7 +3574,7 @@
         </w:tc>
         <w:tc>
           <w:tcPr>
-            <w:tcW w:type="dxa" w:w="1800"/>
+            <w:tcW w:type="dxa" w:w="2000"/>
             <w:shd w:fill="F2F7F6" w:val="clear"/>
             <w:tcMar>
               <w:top w:type="dxa" w:w="80"/>
@@ -3375,18 +3680,50 @@
     </w:tbl>
     <w:p>
       <w:pPr>
-        <w:spacing w:after="140" w:line="300"/>
+        <w:pBdr>
+          <w:top w:val="single" w:color="FBF2E1" w:sz="2" w:space="4"/>
+          <w:bottom w:val="single" w:color="FBF2E1" w:sz="2" w:space="4"/>
+          <w:left w:val="single" w:color="B8860B" w:sz="24" w:space="8"/>
+          <w:right w:val="single" w:color="FBF2E1" w:sz="2" w:space="4"/>
+        </w:pBdr>
+        <w:shd w:fill="FBF2E1" w:val="clear"/>
+        <w:spacing w:after="200" w:before="100" w:line="300"/>
+        <w:ind w:left="100"/>
       </w:pPr>
       <w:r>
         <w:rPr>
           <w:rFonts w:ascii="Calibri" w:cs="Calibri" w:eastAsia="Calibri" w:hAnsi="Calibri"/>
           <w:b/>
           <w:bCs/>
-          <w:color w:val="1B1F1F"/>
-          <w:sz w:val="21"/>
-          <w:szCs w:val="21"/>
+          <w:i/>
+          <w:iCs/>
+          <w:color w:val="1B1F1F"/>
+          <w:sz w:val="20"/>
+          <w:szCs w:val="20"/>
         </w:rPr>
         <w:t xml:space="preserve">Nguyên tắc tầng trên không gọi vượt cấp — vì sao?</w:t>
+      </w:r>
+      <w:r>
+        <w:rPr>
+          <w:rFonts w:ascii="Calibri" w:cs="Calibri" w:eastAsia="Calibri" w:hAnsi="Calibri"/>
+          <w:i/>
+          <w:iCs/>
+          <w:color w:val="1B1F1F"/>
+          <w:sz w:val="20"/>
+          <w:szCs w:val="20"/>
+        </w:rPr>
+        <w:t xml:space="preserve"> </w:t>
+      </w:r>
+      <w:r>
+        <w:rPr>
+          <w:rFonts w:ascii="Calibri" w:cs="Calibri" w:eastAsia="Calibri" w:hAnsi="Calibri"/>
+          <w:i/>
+          <w:iCs/>
+          <w:color w:val="1B1F1F"/>
+          <w:sz w:val="20"/>
+          <w:szCs w:val="20"/>
+        </w:rPr>
+        <w:t xml:space="preserve">(Gợi ý cách nghĩ: nếu tầng Giao diện gọi thẳng xuống tầng Năng lực AI, bỏ qua tầng Điều phối ở giữa, điều gì đặt ở tầng Điều phối sẽ bị bỏ sót?)</w:t>
       </w:r>
     </w:p>
     <w:p>
@@ -3400,7 +3737,7 @@
           <w:sz w:val="20"/>
           <w:szCs w:val="20"/>
         </w:rPr>
-        <w:t xml:space="preserve">__________________________________________________________________</w:t>
+        <w:t xml:space="preserve">_____________________________________________________________________</w:t>
       </w:r>
     </w:p>
     <w:p>
@@ -3422,59 +3759,145 @@
     </w:p>
     <w:p>
       <w:pPr>
-        <w:spacing w:after="140" w:line="300"/>
-      </w:pPr>
-      <w:r>
-        <w:rPr>
-          <w:rFonts w:ascii="Calibri" w:cs="Calibri" w:eastAsia="Calibri" w:hAnsi="Calibri"/>
-          <w:color w:val="1B1F1F"/>
-          <w:sz w:val="21"/>
-          <w:szCs w:val="21"/>
-        </w:rPr>
-        <w:t xml:space="preserve">Mẫu bốn phần ở </w:t>
-      </w:r>
-      <w:r>
-        <w:rPr>
-          <w:rFonts w:ascii="Consolas" w:cs="Consolas" w:eastAsia="Consolas" w:hAnsi="Consolas"/>
-          <w:color w:val="0B3F41"/>
-          <w:sz w:val="20"/>
-          <w:szCs w:val="20"/>
-        </w:rPr>
-        <w:t xml:space="preserve">docs/adr/0000-template.md</w:t>
-      </w:r>
-      <w:r>
-        <w:rPr>
-          <w:rFonts w:ascii="Calibri" w:cs="Calibri" w:eastAsia="Calibri" w:hAnsi="Calibri"/>
-          <w:color w:val="1B1F1F"/>
-          <w:sz w:val="21"/>
-          <w:szCs w:val="21"/>
-        </w:rPr>
-        <w:t xml:space="preserve">. ⚠︎ Phần </w:t>
-      </w:r>
+        <w:pBdr>
+          <w:top w:val="single" w:color="FBF2E1" w:sz="2" w:space="4"/>
+          <w:bottom w:val="single" w:color="FBF2E1" w:sz="2" w:space="4"/>
+          <w:left w:val="single" w:color="B8860B" w:sz="24" w:space="8"/>
+          <w:right w:val="single" w:color="FBF2E1" w:sz="2" w:space="4"/>
+        </w:pBdr>
+        <w:shd w:fill="FBF2E1" w:val="clear"/>
+        <w:spacing w:after="200" w:before="100" w:line="300"/>
+        <w:ind w:left="100"/>
+      </w:pPr>
       <w:r>
         <w:rPr>
           <w:rFonts w:ascii="Calibri" w:cs="Calibri" w:eastAsia="Calibri" w:hAnsi="Calibri"/>
           <w:b/>
           <w:bCs/>
-          <w:color w:val="1B1F1F"/>
-          <w:sz w:val="21"/>
-          <w:szCs w:val="21"/>
-        </w:rPr>
-        <w:t xml:space="preserve">"Các phương án đã cân nhắc"</w:t>
-      </w:r>
-      <w:r>
-        <w:rPr>
-          <w:rFonts w:ascii="Calibri" w:cs="Calibri" w:eastAsia="Calibri" w:hAnsi="Calibri"/>
-          <w:color w:val="1B1F1F"/>
-          <w:sz w:val="21"/>
-          <w:szCs w:val="21"/>
-        </w:rPr>
-        <w:t xml:space="preserve"> là phần hay bị bỏ nhất — thiếu nó thì đó không phải ADR.</w:t>
+          <w:i/>
+          <w:iCs/>
+          <w:color w:val="1B1F1F"/>
+          <w:sz w:val="20"/>
+          <w:szCs w:val="20"/>
+        </w:rPr>
+        <w:t xml:space="preserve">Cách nghĩ:</w:t>
+      </w:r>
+      <w:r>
+        <w:rPr>
+          <w:rFonts w:ascii="Calibri" w:cs="Calibri" w:eastAsia="Calibri" w:hAnsi="Calibri"/>
+          <w:i/>
+          <w:iCs/>
+          <w:color w:val="1B1F1F"/>
+          <w:sz w:val="20"/>
+          <w:szCs w:val="20"/>
+        </w:rPr>
+        <w:t xml:space="preserve"> một ADR (Architecture Decision Record) không phải "báo cáo đã làm gì" — nó ghi lại </w:t>
+      </w:r>
+      <w:r>
+        <w:rPr>
+          <w:rFonts w:ascii="Calibri" w:cs="Calibri" w:eastAsia="Calibri" w:hAnsi="Calibri"/>
+          <w:b/>
+          <w:bCs/>
+          <w:i/>
+          <w:iCs/>
+          <w:color w:val="1B1F1F"/>
+          <w:sz w:val="20"/>
+          <w:szCs w:val="20"/>
+        </w:rPr>
+        <w:t xml:space="preserve">đã cân nhắc và LOẠI những phương án nào, vì sao</w:t>
+      </w:r>
+      <w:r>
+        <w:rPr>
+          <w:rFonts w:ascii="Calibri" w:cs="Calibri" w:eastAsia="Calibri" w:hAnsi="Calibri"/>
+          <w:i/>
+          <w:iCs/>
+          <w:color w:val="1B1F1F"/>
+          <w:sz w:val="20"/>
+          <w:szCs w:val="20"/>
+        </w:rPr>
+        <w:t xml:space="preserve">. Mẫu bốn phần ở </w:t>
+      </w:r>
+      <w:r>
+        <w:rPr>
+          <w:rFonts w:ascii="Consolas" w:cs="Consolas" w:eastAsia="Consolas" w:hAnsi="Consolas"/>
+          <w:i/>
+          <w:iCs/>
+          <w:color w:val="0B3F41"/>
+          <w:sz w:val="19"/>
+          <w:szCs w:val="19"/>
+        </w:rPr>
+        <w:t xml:space="preserve">docs/adr/0000-template.md</w:t>
+      </w:r>
+      <w:r>
+        <w:rPr>
+          <w:rFonts w:ascii="Calibri" w:cs="Calibri" w:eastAsia="Calibri" w:hAnsi="Calibri"/>
+          <w:i/>
+          <w:iCs/>
+          <w:color w:val="1B1F1F"/>
+          <w:sz w:val="20"/>
+          <w:szCs w:val="20"/>
+        </w:rPr>
+        <w:t xml:space="preserve">, và 5 ADR mẫu có sẵn trong </w:t>
+      </w:r>
+      <w:r>
+        <w:rPr>
+          <w:rFonts w:ascii="Consolas" w:cs="Consolas" w:eastAsia="Consolas" w:hAnsi="Consolas"/>
+          <w:i/>
+          <w:iCs/>
+          <w:color w:val="0B3F41"/>
+          <w:sz w:val="19"/>
+          <w:szCs w:val="19"/>
+        </w:rPr>
+        <w:t xml:space="preserve">docs/adr/</w:t>
+      </w:r>
+      <w:r>
+        <w:rPr>
+          <w:rFonts w:ascii="Calibri" w:cs="Calibri" w:eastAsia="Calibri" w:hAnsi="Calibri"/>
+          <w:i/>
+          <w:iCs/>
+          <w:color w:val="1B1F1F"/>
+          <w:sz w:val="20"/>
+          <w:szCs w:val="20"/>
+        </w:rPr>
+        <w:t xml:space="preserve"> để tham khảo cách viết — đọc một bản trước khi viết bản của nhóm.</w:t>
+      </w:r>
+    </w:p>
+    <w:p>
+      <w:pPr>
+        <w:pBdr>
+          <w:top w:val="single" w:color="FCEBE9" w:sz="2" w:space="4"/>
+          <w:bottom w:val="single" w:color="FCEBE9" w:sz="2" w:space="4"/>
+          <w:left w:val="single" w:color="B3261E" w:sz="24" w:space="8"/>
+          <w:right w:val="single" w:color="FCEBE9" w:sz="2" w:space="4"/>
+        </w:pBdr>
+        <w:shd w:fill="FCEBE9" w:val="clear"/>
+        <w:spacing w:after="200" w:before="100" w:line="300"/>
+        <w:ind w:left="100"/>
+      </w:pPr>
+      <w:r>
+        <w:rPr>
+          <w:rFonts w:ascii="Calibri" w:cs="Calibri" w:eastAsia="Calibri" w:hAnsi="Calibri"/>
+          <w:b/>
+          <w:bCs/>
+          <w:color w:val="B3261E"/>
+          <w:sz w:val="20"/>
+          <w:szCs w:val="20"/>
+        </w:rPr>
+        <w:t xml:space="preserve">⚠  </w:t>
+      </w:r>
+      <w:r>
+        <w:rPr>
+          <w:rFonts w:ascii="Calibri" w:cs="Calibri" w:eastAsia="Calibri" w:hAnsi="Calibri"/>
+          <w:color w:val="1B1F1F"/>
+          <w:sz w:val="20"/>
+          <w:szCs w:val="20"/>
+        </w:rPr>
+        <w:t xml:space="preserve">Phần "Các phương án đã cân nhắc" là phần hay bị bỏ nhất — thiếu nó thì đó không phải ADR, chỉ là một tuyên bố. "Phương án đã loại" phải là một lựa chọn thật sự nhóm có cân nhắc, không phải một phương án dựng lên cho có để loại.</w:t>
       </w:r>
     </w:p>
     <w:tbl>
       <w:tblPr>
-        <w:tblW w:type="dxa" w:w="9200"/>
+        <w:tblW w:type="dxa" w:w="9500"/>
         <w:tblBorders>
           <w:top w:val="single" w:color="BFD3D2" w:sz="4"/>
           <w:left w:val="single" w:color="BFD3D2" w:sz="4"/>
@@ -3485,10 +3908,10 @@
         </w:tblBorders>
       </w:tblPr>
       <w:tblGrid>
-        <w:gridCol w:w="500"/>
-        <w:gridCol w:w="1800"/>
-        <w:gridCol w:w="2300"/>
-        <w:gridCol w:w="2300"/>
+        <w:gridCol w:w="400"/>
+        <w:gridCol w:w="2000"/>
+        <w:gridCol w:w="2400"/>
+        <w:gridCol w:w="2400"/>
         <w:gridCol w:w="2300"/>
       </w:tblGrid>
       <w:tr>
@@ -3497,7 +3920,7 @@
         </w:trPr>
         <w:tc>
           <w:tcPr>
-            <w:tcW w:type="dxa" w:w="500"/>
+            <w:tcW w:type="dxa" w:w="400"/>
             <w:shd w:fill="DCEBEA" w:val="clear"/>
             <w:tcMar>
               <w:top w:type="dxa" w:w="80"/>
@@ -3523,7 +3946,7 @@
         </w:tc>
         <w:tc>
           <w:tcPr>
-            <w:tcW w:type="dxa" w:w="1800"/>
+            <w:tcW w:type="dxa" w:w="2000"/>
             <w:shd w:fill="DCEBEA" w:val="clear"/>
             <w:tcMar>
               <w:top w:type="dxa" w:w="80"/>
@@ -3549,7 +3972,7 @@
         </w:tc>
         <w:tc>
           <w:tcPr>
-            <w:tcW w:type="dxa" w:w="2300"/>
+            <w:tcW w:type="dxa" w:w="2400"/>
             <w:shd w:fill="DCEBEA" w:val="clear"/>
             <w:tcMar>
               <w:top w:type="dxa" w:w="80"/>
@@ -3575,7 +3998,7 @@
         </w:tc>
         <w:tc>
           <w:tcPr>
-            <w:tcW w:type="dxa" w:w="2300"/>
+            <w:tcW w:type="dxa" w:w="2400"/>
             <w:shd w:fill="DCEBEA" w:val="clear"/>
             <w:tcMar>
               <w:top w:type="dxa" w:w="80"/>
@@ -3632,7 +4055,7 @@
         </w:trPr>
         <w:tc>
           <w:tcPr>
-            <w:tcW w:type="dxa" w:w="500"/>
+            <w:tcW w:type="dxa" w:w="400"/>
             <w:tcMar>
               <w:top w:type="dxa" w:w="80"/>
               <w:left w:type="dxa" w:w="100"/>
@@ -3657,7 +4080,7 @@
         </w:tc>
         <w:tc>
           <w:tcPr>
-            <w:tcW w:type="dxa" w:w="1800"/>
+            <w:tcW w:type="dxa" w:w="2000"/>
             <w:tcMar>
               <w:top w:type="dxa" w:w="80"/>
               <w:left w:type="dxa" w:w="100"/>
@@ -3682,7 +4105,7 @@
         </w:tc>
         <w:tc>
           <w:tcPr>
-            <w:tcW w:type="dxa" w:w="2300"/>
+            <w:tcW w:type="dxa" w:w="2400"/>
             <w:tcMar>
               <w:top w:type="dxa" w:w="80"/>
               <w:left w:type="dxa" w:w="100"/>
@@ -3707,7 +4130,7 @@
         </w:tc>
         <w:tc>
           <w:tcPr>
-            <w:tcW w:type="dxa" w:w="2300"/>
+            <w:tcW w:type="dxa" w:w="2400"/>
             <w:tcMar>
               <w:top w:type="dxa" w:w="80"/>
               <w:left w:type="dxa" w:w="100"/>
@@ -3762,7 +4185,7 @@
         </w:trPr>
         <w:tc>
           <w:tcPr>
-            <w:tcW w:type="dxa" w:w="500"/>
+            <w:tcW w:type="dxa" w:w="400"/>
             <w:shd w:fill="F2F7F6" w:val="clear"/>
             <w:tcMar>
               <w:top w:type="dxa" w:w="80"/>
@@ -3788,7 +4211,7 @@
         </w:tc>
         <w:tc>
           <w:tcPr>
-            <w:tcW w:type="dxa" w:w="1800"/>
+            <w:tcW w:type="dxa" w:w="2000"/>
             <w:shd w:fill="F2F7F6" w:val="clear"/>
             <w:tcMar>
               <w:top w:type="dxa" w:w="80"/>
@@ -3814,7 +4237,7 @@
         </w:tc>
         <w:tc>
           <w:tcPr>
-            <w:tcW w:type="dxa" w:w="2300"/>
+            <w:tcW w:type="dxa" w:w="2400"/>
             <w:shd w:fill="F2F7F6" w:val="clear"/>
             <w:tcMar>
               <w:top w:type="dxa" w:w="80"/>
@@ -3840,7 +4263,7 @@
         </w:tc>
         <w:tc>
           <w:tcPr>
-            <w:tcW w:type="dxa" w:w="2300"/>
+            <w:tcW w:type="dxa" w:w="2400"/>
             <w:shd w:fill="F2F7F6" w:val="clear"/>
             <w:tcMar>
               <w:top w:type="dxa" w:w="80"/>
@@ -3897,7 +4320,7 @@
         </w:trPr>
         <w:tc>
           <w:tcPr>
-            <w:tcW w:type="dxa" w:w="500"/>
+            <w:tcW w:type="dxa" w:w="400"/>
             <w:tcMar>
               <w:top w:type="dxa" w:w="80"/>
               <w:left w:type="dxa" w:w="100"/>
@@ -3922,7 +4345,7 @@
         </w:tc>
         <w:tc>
           <w:tcPr>
-            <w:tcW w:type="dxa" w:w="1800"/>
+            <w:tcW w:type="dxa" w:w="2000"/>
             <w:tcMar>
               <w:top w:type="dxa" w:w="80"/>
               <w:left w:type="dxa" w:w="100"/>
@@ -3947,7 +4370,7 @@
         </w:tc>
         <w:tc>
           <w:tcPr>
-            <w:tcW w:type="dxa" w:w="2300"/>
+            <w:tcW w:type="dxa" w:w="2400"/>
             <w:tcMar>
               <w:top w:type="dxa" w:w="80"/>
               <w:left w:type="dxa" w:w="100"/>
@@ -3972,7 +4395,7 @@
         </w:tc>
         <w:tc>
           <w:tcPr>
-            <w:tcW w:type="dxa" w:w="2300"/>
+            <w:tcW w:type="dxa" w:w="2400"/>
             <w:tcMar>
               <w:top w:type="dxa" w:w="80"/>
               <w:left w:type="dxa" w:w="100"/>
@@ -4027,7 +4450,7 @@
         </w:trPr>
         <w:tc>
           <w:tcPr>
-            <w:tcW w:type="dxa" w:w="500"/>
+            <w:tcW w:type="dxa" w:w="400"/>
             <w:shd w:fill="F2F7F6" w:val="clear"/>
             <w:tcMar>
               <w:top w:type="dxa" w:w="80"/>
@@ -4053,7 +4476,7 @@
         </w:tc>
         <w:tc>
           <w:tcPr>
-            <w:tcW w:type="dxa" w:w="1800"/>
+            <w:tcW w:type="dxa" w:w="2000"/>
             <w:shd w:fill="F2F7F6" w:val="clear"/>
             <w:tcMar>
               <w:top w:type="dxa" w:w="80"/>
@@ -4079,7 +4502,7 @@
         </w:tc>
         <w:tc>
           <w:tcPr>
-            <w:tcW w:type="dxa" w:w="2300"/>
+            <w:tcW w:type="dxa" w:w="2400"/>
             <w:shd w:fill="F2F7F6" w:val="clear"/>
             <w:tcMar>
               <w:top w:type="dxa" w:w="80"/>
@@ -4105,7 +4528,7 @@
         </w:tc>
         <w:tc>
           <w:tcPr>
-            <w:tcW w:type="dxa" w:w="2300"/>
+            <w:tcW w:type="dxa" w:w="2400"/>
             <w:shd w:fill="F2F7F6" w:val="clear"/>
             <w:tcMar>
               <w:top w:type="dxa" w:w="80"/>
@@ -4162,7 +4585,7 @@
         </w:trPr>
         <w:tc>
           <w:tcPr>
-            <w:tcW w:type="dxa" w:w="500"/>
+            <w:tcW w:type="dxa" w:w="400"/>
             <w:tcMar>
               <w:top w:type="dxa" w:w="80"/>
               <w:left w:type="dxa" w:w="100"/>
@@ -4187,7 +4610,7 @@
         </w:tc>
         <w:tc>
           <w:tcPr>
-            <w:tcW w:type="dxa" w:w="1800"/>
+            <w:tcW w:type="dxa" w:w="2000"/>
             <w:tcMar>
               <w:top w:type="dxa" w:w="80"/>
               <w:left w:type="dxa" w:w="100"/>
@@ -4212,7 +4635,7 @@
         </w:tc>
         <w:tc>
           <w:tcPr>
-            <w:tcW w:type="dxa" w:w="2300"/>
+            <w:tcW w:type="dxa" w:w="2400"/>
             <w:tcMar>
               <w:top w:type="dxa" w:w="80"/>
               <w:left w:type="dxa" w:w="100"/>
@@ -4237,7 +4660,7 @@
         </w:tc>
         <w:tc>
           <w:tcPr>
-            <w:tcW w:type="dxa" w:w="2300"/>
+            <w:tcW w:type="dxa" w:w="2400"/>
             <w:tcMar>
               <w:top w:type="dxa" w:w="80"/>
               <w:left w:type="dxa" w:w="100"/>
@@ -4398,6 +4821,38 @@
     </w:p>
     <w:p>
       <w:pPr>
+        <w:spacing w:after="140" w:line="300"/>
+      </w:pPr>
+      <w:r>
+        <w:rPr>
+          <w:rFonts w:ascii="Calibri" w:cs="Calibri" w:eastAsia="Calibri" w:hAnsi="Calibri"/>
+          <w:color w:val="1B1F1F"/>
+          <w:sz w:val="21"/>
+          <w:szCs w:val="21"/>
+        </w:rPr>
+        <w:t xml:space="preserve">Mục đích: chứng minh bằng tay rằng đổi </w:t>
+      </w:r>
+      <w:r>
+        <w:rPr>
+          <w:rFonts w:ascii="Consolas" w:cs="Consolas" w:eastAsia="Consolas" w:hAnsi="Consolas"/>
+          <w:color w:val="0B3F41"/>
+          <w:sz w:val="20"/>
+          <w:szCs w:val="20"/>
+        </w:rPr>
+        <w:t xml:space="preserve">CONFIG_PROFILE</w:t>
+      </w:r>
+      <w:r>
+        <w:rPr>
+          <w:rFonts w:ascii="Calibri" w:cs="Calibri" w:eastAsia="Calibri" w:hAnsi="Calibri"/>
+          <w:color w:val="1B1F1F"/>
+          <w:sz w:val="21"/>
+          <w:szCs w:val="21"/>
+        </w:rPr>
+        <w:t xml:space="preserve"> chỉ là đổi biến môi trường — nếu phải sửa một dòng code nào đó, đó là dấu hiệu kiến trúc đang sai (hạ tầng và logic nghiệp vụ bị trộn lẫn).</w:t>
+      </w:r>
+    </w:p>
+    <w:p>
+      <w:pPr>
         <w:pBdr>
           <w:top w:val="single" w:color="EEF3F2" w:sz="2" w:space="3"/>
           <w:bottom w:val="single" w:color="EEF3F2" w:sz="2" w:space="3"/>
@@ -4442,7 +4897,7 @@
     </w:p>
     <w:tbl>
       <w:tblPr>
-        <w:tblW w:type="dxa" w:w="8800"/>
+        <w:tblW w:type="dxa" w:w="9100"/>
         <w:tblBorders>
           <w:top w:val="single" w:color="BFD3D2" w:sz="4"/>
           <w:left w:val="single" w:color="BFD3D2" w:sz="4"/>
@@ -4453,9 +4908,9 @@
         </w:tblBorders>
       </w:tblPr>
       <w:tblGrid>
-        <w:gridCol w:w="1800"/>
+        <w:gridCol w:w="2000"/>
         <w:gridCol w:w="2200"/>
-        <w:gridCol w:w="4800"/>
+        <w:gridCol w:w="4900"/>
       </w:tblGrid>
       <w:tr>
         <w:trPr>
@@ -4463,7 +4918,7 @@
         </w:trPr>
         <w:tc>
           <w:tcPr>
-            <w:tcW w:type="dxa" w:w="1800"/>
+            <w:tcW w:type="dxa" w:w="2000"/>
             <w:shd w:fill="DCEBEA" w:val="clear"/>
             <w:tcMar>
               <w:top w:type="dxa" w:w="80"/>
@@ -4507,7 +4962,7 @@
         </w:tc>
         <w:tc>
           <w:tcPr>
-            <w:tcW w:type="dxa" w:w="4800"/>
+            <w:tcW w:type="dxa" w:w="4900"/>
             <w:shd w:fill="DCEBEA" w:val="clear"/>
             <w:tcMar>
               <w:top w:type="dxa" w:w="80"/>
@@ -4538,7 +4993,7 @@
         </w:trPr>
         <w:tc>
           <w:tcPr>
-            <w:tcW w:type="dxa" w:w="1800"/>
+            <w:tcW w:type="dxa" w:w="2000"/>
             <w:tcMar>
               <w:top w:type="dxa" w:w="80"/>
               <w:left w:type="dxa" w:w="100"/>
@@ -4588,7 +5043,7 @@
         </w:tc>
         <w:tc>
           <w:tcPr>
-            <w:tcW w:type="dxa" w:w="4800"/>
+            <w:tcW w:type="dxa" w:w="4900"/>
             <w:tcMar>
               <w:top w:type="dxa" w:w="80"/>
               <w:left w:type="dxa" w:w="100"/>
@@ -4629,7 +5084,7 @@
         </w:trPr>
         <w:tc>
           <w:tcPr>
-            <w:tcW w:type="dxa" w:w="1800"/>
+            <w:tcW w:type="dxa" w:w="2000"/>
             <w:shd w:fill="F2F7F6" w:val="clear"/>
             <w:tcMar>
               <w:top w:type="dxa" w:w="80"/>
@@ -4681,7 +5136,7 @@
         </w:tc>
         <w:tc>
           <w:tcPr>
-            <w:tcW w:type="dxa" w:w="4800"/>
+            <w:tcW w:type="dxa" w:w="4900"/>
             <w:shd w:fill="F2F7F6" w:val="clear"/>
             <w:tcMar>
               <w:top w:type="dxa" w:w="80"/>
@@ -4764,36 +5219,46 @@
       <w:r>
         <w:rPr>
           <w:rFonts w:ascii="Calibri" w:cs="Calibri" w:eastAsia="Calibri" w:hAnsi="Calibri"/>
-          <w:b/>
-          <w:bCs/>
           <w:color w:val="1B1F1F"/>
           <w:sz w:val="21"/>
           <w:szCs w:val="21"/>
         </w:rPr>
-        <w:t xml:space="preserve">CI giai đoạn 1 (kiểm tra mã):</w:t>
-      </w:r>
-      <w:r>
-        <w:rPr>
-          <w:rFonts w:ascii="Calibri" w:cs="Calibri" w:eastAsia="Calibri" w:hAnsi="Calibri"/>
-          <w:color w:val="1B1F1F"/>
-          <w:sz w:val="21"/>
-          <w:szCs w:val="21"/>
-        </w:rPr>
-        <w:t xml:space="preserve">  ☐ xanh     ☐ đỏ</w:t>
-      </w:r>
-    </w:p>
-    <w:p>
-      <w:pPr>
-        <w:spacing w:after="140" w:line="300"/>
-      </w:pPr>
-      <w:r>
-        <w:rPr>
-          <w:rFonts w:ascii="Calibri" w:cs="Calibri" w:eastAsia="Calibri" w:hAnsi="Calibri"/>
-          <w:color w:val="1B1F1F"/>
-          <w:sz w:val="21"/>
-          <w:szCs w:val="21"/>
-        </w:rPr>
-        <w:t xml:space="preserve">Nếu đỏ, lỗi gì và sửa thế nào?</w:t>
+        <w:t xml:space="preserve">CI giai đoạn 1 (kiểm tra mã):  ☐ xanh     ☐ đỏ</w:t>
+      </w:r>
+    </w:p>
+    <w:p>
+      <w:pPr>
+        <w:pBdr>
+          <w:top w:val="single" w:color="FBF2E1" w:sz="2" w:space="4"/>
+          <w:bottom w:val="single" w:color="FBF2E1" w:sz="2" w:space="4"/>
+          <w:left w:val="single" w:color="B8860B" w:sz="24" w:space="8"/>
+          <w:right w:val="single" w:color="FBF2E1" w:sz="2" w:space="4"/>
+        </w:pBdr>
+        <w:shd w:fill="FBF2E1" w:val="clear"/>
+        <w:spacing w:after="200" w:before="100" w:line="300"/>
+        <w:ind w:left="100"/>
+      </w:pPr>
+      <w:r>
+        <w:rPr>
+          <w:rFonts w:ascii="Calibri" w:cs="Calibri" w:eastAsia="Calibri" w:hAnsi="Calibri"/>
+          <w:i/>
+          <w:iCs/>
+          <w:color w:val="1B1F1F"/>
+          <w:sz w:val="20"/>
+          <w:szCs w:val="20"/>
+        </w:rPr>
+        <w:t xml:space="preserve">Nếu đỏ, lỗi gì và sửa thế nào? </w:t>
+      </w:r>
+      <w:r>
+        <w:rPr>
+          <w:rFonts w:ascii="Calibri" w:cs="Calibri" w:eastAsia="Calibri" w:hAnsi="Calibri"/>
+          <w:i/>
+          <w:iCs/>
+          <w:color w:val="1B1F1F"/>
+          <w:sz w:val="20"/>
+          <w:szCs w:val="20"/>
+        </w:rPr>
+        <w:t xml:space="preserve">(CI đỏ ở lần đầu là bình thường — đọc kỹ log lỗi trước khi hỏi trợ giảng.)</w:t>
       </w:r>
     </w:p>
     <w:p>
@@ -4807,7 +5272,7 @@
           <w:sz w:val="20"/>
           <w:szCs w:val="20"/>
         </w:rPr>
-        <w:t xml:space="preserve">__________________________________________________________________</w:t>
+        <w:t xml:space="preserve">_____________________________________________________________________</w:t>
       </w:r>
     </w:p>
     <w:p>
@@ -4964,7 +5429,7 @@
           <w:sz w:val="20"/>
           <w:szCs w:val="20"/>
         </w:rPr>
-        <w:t xml:space="preserve">___/___</w:t>
+        <w:t xml:space="preserve">____/____</w:t>
       </w:r>
     </w:p>
     <w:p>
@@ -5166,7 +5631,7 @@
           <w:sz w:val="21"/>
           <w:szCs w:val="21"/>
         </w:rPr>
-        <w:t xml:space="preserve"> — dự đoán trước cấu trúc sẽ xây ở Session 4.</w:t>
+        <w:t xml:space="preserve"> — dự đoán trước cấu trúc sẽ xây ở Session 4, dựa trên những gì đã đọc ở Bước 1.</w:t>
       </w:r>
     </w:p>
     <w:p>
@@ -5185,7 +5650,7 @@
     </w:p>
     <w:tbl>
       <w:tblPr>
-        <w:tblW w:type="dxa" w:w="9200"/>
+        <w:tblW w:type="dxa" w:w="9100"/>
         <w:tblBorders>
           <w:top w:val="single" w:color="BFD3D2" w:sz="4"/>
           <w:left w:val="single" w:color="BFD3D2" w:sz="4"/>
@@ -5198,7 +5663,7 @@
       <w:tblGrid>
         <w:gridCol w:w="3000"/>
         <w:gridCol w:w="3000"/>
-        <w:gridCol w:w="3200"/>
+        <w:gridCol w:w="3100"/>
       </w:tblGrid>
       <w:tr>
         <w:trPr>
@@ -5258,7 +5723,7 @@
         </w:tc>
         <w:tc>
           <w:tcPr>
-            <w:tcW w:type="dxa" w:w="3200"/>
+            <w:tcW w:type="dxa" w:w="3100"/>
             <w:shd w:fill="DCEBEA" w:val="clear"/>
             <w:tcMar>
               <w:top w:type="dxa" w:w="80"/>
@@ -5308,7 +5773,7 @@
                 <w:sz w:val="19"/>
                 <w:szCs w:val="19"/>
               </w:rPr>
-              <w:t xml:space="preserve">____________________</w:t>
+              <w:t xml:space="preserve">________________</w:t>
             </w:r>
           </w:p>
         </w:tc>
@@ -5333,32 +5798,32 @@
                 <w:sz w:val="19"/>
                 <w:szCs w:val="19"/>
               </w:rPr>
-              <w:t xml:space="preserve">____________________</w:t>
-            </w:r>
-          </w:p>
-        </w:tc>
-        <w:tc>
-          <w:tcPr>
-            <w:tcW w:type="dxa" w:w="3200"/>
-            <w:tcMar>
-              <w:top w:type="dxa" w:w="80"/>
-              <w:left w:type="dxa" w:w="100"/>
-              <w:bottom w:type="dxa" w:w="80"/>
-              <w:right w:type="dxa" w:w="100"/>
-            </w:tcMar>
-            <w:vAlign w:val="top"/>
-          </w:tcPr>
-          <w:p>
-            <w:r>
-              <w:rPr>
-                <w:rFonts w:ascii="Consolas" w:cs="Consolas" w:eastAsia="Consolas" w:hAnsi="Consolas"/>
-                <w:b w:val="false"/>
-                <w:bCs w:val="false"/>
-                <w:color w:val="0B3F41"/>
-                <w:sz w:val="19"/>
-                <w:szCs w:val="19"/>
-              </w:rPr>
-              <w:t xml:space="preserve">____________________</w:t>
+              <w:t xml:space="preserve">________________</w:t>
+            </w:r>
+          </w:p>
+        </w:tc>
+        <w:tc>
+          <w:tcPr>
+            <w:tcW w:type="dxa" w:w="3100"/>
+            <w:tcMar>
+              <w:top w:type="dxa" w:w="80"/>
+              <w:left w:type="dxa" w:w="100"/>
+              <w:bottom w:type="dxa" w:w="80"/>
+              <w:right w:type="dxa" w:w="100"/>
+            </w:tcMar>
+            <w:vAlign w:val="top"/>
+          </w:tcPr>
+          <w:p>
+            <w:r>
+              <w:rPr>
+                <w:rFonts w:ascii="Consolas" w:cs="Consolas" w:eastAsia="Consolas" w:hAnsi="Consolas"/>
+                <w:b w:val="false"/>
+                <w:bCs w:val="false"/>
+                <w:color w:val="0B3F41"/>
+                <w:sz w:val="19"/>
+                <w:szCs w:val="19"/>
+              </w:rPr>
+              <w:t xml:space="preserve">________________</w:t>
             </w:r>
           </w:p>
         </w:tc>

</xml_diff>